<commit_message>
Fix ODT generation for inline-table template + regenerate all 56 variants
The updated Logsheet_Template.odt switched from floating draw:frame tables
(9 office:text children, _GoBack bookmark, per-copy style cloning) to an
all-inline layout (12 children, tables separated by spacer paragraphs) that
mirrors the DOCX template. The old ODT engine no longer matched, so ODT
generation was broken.

- Rewrite build_odt for the 12-child inline layout, paralleling build_docx
- Replace _clone_4e_frame with _clone_4e_table: extra 4E copies just duplicate
  the Table2 element with a unique table:name; style references are shared
- Remove dead _strip_odt_bookmark helper; update docstrings
- Regenerate all 28 DOCX + 28 ODT variants from the updated templates

All 56 outputs validated: valid zips, well-formed XML, correct table counts,
no duplicate table:name, correct 3PET Total-row positions.

Co-Authored-By: Claude Opus 4.8 (1M context) <noreply@anthropic.com>
</commit_message>
<xml_diff>
--- a/template_variants/DOCX/3HE_3PET1_0EST.docx
+++ b/template_variants/DOCX/3HE_3PET1_0EST.docx
@@ -23,6 +23,8 @@
         </w:rPr>
         <w:t>‡gvUi mvB‡Kj jMkxU</w:t>
       </w:r>
+      <w:bookmarkStart w:id="0" w:name="_GoBack"/>
+      <w:bookmarkEnd w:id="0"/>
     </w:p>
     <w:tbl>
       <w:tblPr>
@@ -110,8 +112,6 @@
               </w:rPr>
               <w:t>ª</w:t>
             </w:r>
-            <w:bookmarkStart w:id="0" w:name="_GoBack"/>
-            <w:bookmarkEnd w:id="0"/>
             <w:r>
               <w:rPr>
                 <w:rFonts w:ascii="SutonnyMJ" w:hAnsi="SutonnyMJ" w:cs="SutonnyMJ"/>
@@ -1884,11 +1884,11 @@
         <w:gridCol w:w="1080"/>
         <w:gridCol w:w="1080"/>
         <w:gridCol w:w="990"/>
-        <w:gridCol w:w="900"/>
+        <w:gridCol w:w="877"/>
         <w:gridCol w:w="1260"/>
-        <w:gridCol w:w="1260"/>
-        <w:gridCol w:w="1260"/>
-        <w:gridCol w:w="1260"/>
+        <w:gridCol w:w="1170"/>
+        <w:gridCol w:w="1170"/>
+        <w:gridCol w:w="1463"/>
         <w:gridCol w:w="990"/>
       </w:tblGrid>
       <w:tr>
@@ -2047,7 +2047,7 @@
         </w:tc>
         <w:tc>
           <w:tcPr>
-            <w:tcW w:w="2160" w:type="dxa"/>
+            <w:tcW w:w="2137" w:type="dxa"/>
             <w:gridSpan w:val="2"/>
             <w:tcBorders>
               <w:bottom w:val="single" w:sz="4" w:space="0" w:color="auto"/>
@@ -2077,7 +2077,7 @@
         </w:tc>
         <w:tc>
           <w:tcPr>
-            <w:tcW w:w="1260" w:type="dxa"/>
+            <w:tcW w:w="1170" w:type="dxa"/>
             <w:vMerge w:val="restart"/>
             <w:vAlign w:val="center"/>
           </w:tcPr>
@@ -2124,7 +2124,7 @@
         </w:tc>
         <w:tc>
           <w:tcPr>
-            <w:tcW w:w="1260" w:type="dxa"/>
+            <w:tcW w:w="1170" w:type="dxa"/>
             <w:vMerge w:val="restart"/>
             <w:vAlign w:val="center"/>
           </w:tcPr>
@@ -2171,7 +2171,7 @@
         </w:tc>
         <w:tc>
           <w:tcPr>
-            <w:tcW w:w="1260" w:type="dxa"/>
+            <w:tcW w:w="1463" w:type="dxa"/>
             <w:vMerge w:val="restart"/>
             <w:vAlign w:val="center"/>
           </w:tcPr>
@@ -2380,7 +2380,7 @@
         </w:tc>
         <w:tc>
           <w:tcPr>
-            <w:tcW w:w="900" w:type="dxa"/>
+            <w:tcW w:w="877" w:type="dxa"/>
             <w:tcBorders>
               <w:top w:val="single" w:sz="4" w:space="0" w:color="auto"/>
             </w:tcBorders>
@@ -2438,7 +2438,7 @@
         </w:tc>
         <w:tc>
           <w:tcPr>
-            <w:tcW w:w="1260" w:type="dxa"/>
+            <w:tcW w:w="1170" w:type="dxa"/>
             <w:vMerge/>
             <w:vAlign w:val="center"/>
           </w:tcPr>
@@ -2456,7 +2456,7 @@
         </w:tc>
         <w:tc>
           <w:tcPr>
-            <w:tcW w:w="1260" w:type="dxa"/>
+            <w:tcW w:w="1170" w:type="dxa"/>
             <w:vMerge/>
             <w:vAlign w:val="center"/>
           </w:tcPr>
@@ -2474,7 +2474,7 @@
         </w:tc>
         <w:tc>
           <w:tcPr>
-            <w:tcW w:w="1260" w:type="dxa"/>
+            <w:tcW w:w="1463" w:type="dxa"/>
             <w:vMerge/>
             <w:vAlign w:val="center"/>
           </w:tcPr>
@@ -2642,7 +2642,7 @@
         </w:tc>
         <w:tc>
           <w:tcPr>
-            <w:tcW w:w="900" w:type="dxa"/>
+            <w:tcW w:w="877" w:type="dxa"/>
             <w:vAlign w:val="center"/>
           </w:tcPr>
           <w:p>
@@ -2676,41 +2676,41 @@
         </w:tc>
         <w:tc>
           <w:tcPr>
-            <w:tcW w:w="1260" w:type="dxa"/>
-            <w:vAlign w:val="center"/>
-          </w:tcPr>
-          <w:p>
-            <w:pPr>
-              <w:jc w:val="center"/>
-              <w:rPr>
-                <w:rFonts w:ascii="SutonnyMJ" w:hAnsi="SutonnyMJ" w:cs="SutonnyMJ"/>
-                <w:b/>
-                <w:sz w:val="32"/>
-                <w:szCs w:val="32"/>
-              </w:rPr>
-            </w:pPr>
-          </w:p>
-        </w:tc>
-        <w:tc>
-          <w:tcPr>
-            <w:tcW w:w="1260" w:type="dxa"/>
-            <w:vAlign w:val="center"/>
-          </w:tcPr>
-          <w:p>
-            <w:pPr>
-              <w:jc w:val="center"/>
-              <w:rPr>
-                <w:rFonts w:ascii="SutonnyMJ" w:hAnsi="SutonnyMJ" w:cs="SutonnyMJ"/>
-                <w:b/>
-                <w:sz w:val="32"/>
-                <w:szCs w:val="32"/>
-              </w:rPr>
-            </w:pPr>
-          </w:p>
-        </w:tc>
-        <w:tc>
-          <w:tcPr>
-            <w:tcW w:w="1260" w:type="dxa"/>
+            <w:tcW w:w="1170" w:type="dxa"/>
+            <w:vAlign w:val="center"/>
+          </w:tcPr>
+          <w:p>
+            <w:pPr>
+              <w:jc w:val="center"/>
+              <w:rPr>
+                <w:rFonts w:ascii="SutonnyMJ" w:hAnsi="SutonnyMJ" w:cs="SutonnyMJ"/>
+                <w:b/>
+                <w:sz w:val="32"/>
+                <w:szCs w:val="32"/>
+              </w:rPr>
+            </w:pPr>
+          </w:p>
+        </w:tc>
+        <w:tc>
+          <w:tcPr>
+            <w:tcW w:w="1170" w:type="dxa"/>
+            <w:vAlign w:val="center"/>
+          </w:tcPr>
+          <w:p>
+            <w:pPr>
+              <w:jc w:val="center"/>
+              <w:rPr>
+                <w:rFonts w:ascii="SutonnyMJ" w:hAnsi="SutonnyMJ" w:cs="SutonnyMJ"/>
+                <w:b/>
+                <w:sz w:val="32"/>
+                <w:szCs w:val="32"/>
+              </w:rPr>
+            </w:pPr>
+          </w:p>
+        </w:tc>
+        <w:tc>
+          <w:tcPr>
+            <w:tcW w:w="1463" w:type="dxa"/>
             <w:vAlign w:val="center"/>
           </w:tcPr>
           <w:p>
@@ -2866,7 +2866,7 @@
         </w:tc>
         <w:tc>
           <w:tcPr>
-            <w:tcW w:w="900" w:type="dxa"/>
+            <w:tcW w:w="877" w:type="dxa"/>
           </w:tcPr>
           <w:p>
             <w:pPr>
@@ -2898,39 +2898,39 @@
         </w:tc>
         <w:tc>
           <w:tcPr>
-            <w:tcW w:w="1260" w:type="dxa"/>
-          </w:tcPr>
-          <w:p>
-            <w:pPr>
-              <w:jc w:val="center"/>
-              <w:rPr>
-                <w:rFonts w:ascii="SutonnyMJ" w:hAnsi="SutonnyMJ" w:cs="SutonnyMJ"/>
-                <w:b/>
-                <w:sz w:val="32"/>
-                <w:szCs w:val="32"/>
-              </w:rPr>
-            </w:pPr>
-          </w:p>
-        </w:tc>
-        <w:tc>
-          <w:tcPr>
-            <w:tcW w:w="1260" w:type="dxa"/>
-          </w:tcPr>
-          <w:p>
-            <w:pPr>
-              <w:jc w:val="center"/>
-              <w:rPr>
-                <w:rFonts w:ascii="SutonnyMJ" w:hAnsi="SutonnyMJ" w:cs="SutonnyMJ"/>
-                <w:b/>
-                <w:sz w:val="32"/>
-                <w:szCs w:val="32"/>
-              </w:rPr>
-            </w:pPr>
-          </w:p>
-        </w:tc>
-        <w:tc>
-          <w:tcPr>
-            <w:tcW w:w="1260" w:type="dxa"/>
+            <w:tcW w:w="1170" w:type="dxa"/>
+          </w:tcPr>
+          <w:p>
+            <w:pPr>
+              <w:jc w:val="center"/>
+              <w:rPr>
+                <w:rFonts w:ascii="SutonnyMJ" w:hAnsi="SutonnyMJ" w:cs="SutonnyMJ"/>
+                <w:b/>
+                <w:sz w:val="32"/>
+                <w:szCs w:val="32"/>
+              </w:rPr>
+            </w:pPr>
+          </w:p>
+        </w:tc>
+        <w:tc>
+          <w:tcPr>
+            <w:tcW w:w="1170" w:type="dxa"/>
+          </w:tcPr>
+          <w:p>
+            <w:pPr>
+              <w:jc w:val="center"/>
+              <w:rPr>
+                <w:rFonts w:ascii="SutonnyMJ" w:hAnsi="SutonnyMJ" w:cs="SutonnyMJ"/>
+                <w:b/>
+                <w:sz w:val="32"/>
+                <w:szCs w:val="32"/>
+              </w:rPr>
+            </w:pPr>
+          </w:p>
+        </w:tc>
+        <w:tc>
+          <w:tcPr>
+            <w:tcW w:w="1463" w:type="dxa"/>
           </w:tcPr>
           <w:p>
             <w:pPr>
@@ -3074,7 +3074,7 @@
         </w:tc>
         <w:tc>
           <w:tcPr>
-            <w:tcW w:w="900" w:type="dxa"/>
+            <w:tcW w:w="877" w:type="dxa"/>
           </w:tcPr>
           <w:p>
             <w:pPr>
@@ -3106,39 +3106,39 @@
         </w:tc>
         <w:tc>
           <w:tcPr>
-            <w:tcW w:w="1260" w:type="dxa"/>
-          </w:tcPr>
-          <w:p>
-            <w:pPr>
-              <w:jc w:val="center"/>
-              <w:rPr>
-                <w:rFonts w:ascii="SutonnyMJ" w:hAnsi="SutonnyMJ" w:cs="SutonnyMJ"/>
-                <w:b/>
-                <w:sz w:val="32"/>
-                <w:szCs w:val="32"/>
-              </w:rPr>
-            </w:pPr>
-          </w:p>
-        </w:tc>
-        <w:tc>
-          <w:tcPr>
-            <w:tcW w:w="1260" w:type="dxa"/>
-          </w:tcPr>
-          <w:p>
-            <w:pPr>
-              <w:jc w:val="center"/>
-              <w:rPr>
-                <w:rFonts w:ascii="SutonnyMJ" w:hAnsi="SutonnyMJ" w:cs="SutonnyMJ"/>
-                <w:b/>
-                <w:sz w:val="32"/>
-                <w:szCs w:val="32"/>
-              </w:rPr>
-            </w:pPr>
-          </w:p>
-        </w:tc>
-        <w:tc>
-          <w:tcPr>
-            <w:tcW w:w="1260" w:type="dxa"/>
+            <w:tcW w:w="1170" w:type="dxa"/>
+          </w:tcPr>
+          <w:p>
+            <w:pPr>
+              <w:jc w:val="center"/>
+              <w:rPr>
+                <w:rFonts w:ascii="SutonnyMJ" w:hAnsi="SutonnyMJ" w:cs="SutonnyMJ"/>
+                <w:b/>
+                <w:sz w:val="32"/>
+                <w:szCs w:val="32"/>
+              </w:rPr>
+            </w:pPr>
+          </w:p>
+        </w:tc>
+        <w:tc>
+          <w:tcPr>
+            <w:tcW w:w="1170" w:type="dxa"/>
+          </w:tcPr>
+          <w:p>
+            <w:pPr>
+              <w:jc w:val="center"/>
+              <w:rPr>
+                <w:rFonts w:ascii="SutonnyMJ" w:hAnsi="SutonnyMJ" w:cs="SutonnyMJ"/>
+                <w:b/>
+                <w:sz w:val="32"/>
+                <w:szCs w:val="32"/>
+              </w:rPr>
+            </w:pPr>
+          </w:p>
+        </w:tc>
+        <w:tc>
+          <w:tcPr>
+            <w:tcW w:w="1463" w:type="dxa"/>
           </w:tcPr>
           <w:p>
             <w:pPr>
@@ -3279,7 +3279,7 @@
         </w:tc>
         <w:tc>
           <w:tcPr>
-            <w:tcW w:w="900" w:type="dxa"/>
+            <w:tcW w:w="877" w:type="dxa"/>
           </w:tcPr>
           <w:p>
             <w:pPr>
@@ -3311,39 +3311,39 @@
         </w:tc>
         <w:tc>
           <w:tcPr>
-            <w:tcW w:w="1260" w:type="dxa"/>
-          </w:tcPr>
-          <w:p>
-            <w:pPr>
-              <w:jc w:val="center"/>
-              <w:rPr>
-                <w:rFonts w:ascii="SutonnyMJ" w:hAnsi="SutonnyMJ" w:cs="SutonnyMJ"/>
-                <w:b/>
-                <w:sz w:val="32"/>
-                <w:szCs w:val="32"/>
-              </w:rPr>
-            </w:pPr>
-          </w:p>
-        </w:tc>
-        <w:tc>
-          <w:tcPr>
-            <w:tcW w:w="1260" w:type="dxa"/>
-          </w:tcPr>
-          <w:p>
-            <w:pPr>
-              <w:jc w:val="center"/>
-              <w:rPr>
-                <w:rFonts w:ascii="SutonnyMJ" w:hAnsi="SutonnyMJ" w:cs="SutonnyMJ"/>
-                <w:b/>
-                <w:sz w:val="32"/>
-                <w:szCs w:val="32"/>
-              </w:rPr>
-            </w:pPr>
-          </w:p>
-        </w:tc>
-        <w:tc>
-          <w:tcPr>
-            <w:tcW w:w="1260" w:type="dxa"/>
+            <w:tcW w:w="1170" w:type="dxa"/>
+          </w:tcPr>
+          <w:p>
+            <w:pPr>
+              <w:jc w:val="center"/>
+              <w:rPr>
+                <w:rFonts w:ascii="SutonnyMJ" w:hAnsi="SutonnyMJ" w:cs="SutonnyMJ"/>
+                <w:b/>
+                <w:sz w:val="32"/>
+                <w:szCs w:val="32"/>
+              </w:rPr>
+            </w:pPr>
+          </w:p>
+        </w:tc>
+        <w:tc>
+          <w:tcPr>
+            <w:tcW w:w="1170" w:type="dxa"/>
+          </w:tcPr>
+          <w:p>
+            <w:pPr>
+              <w:jc w:val="center"/>
+              <w:rPr>
+                <w:rFonts w:ascii="SutonnyMJ" w:hAnsi="SutonnyMJ" w:cs="SutonnyMJ"/>
+                <w:b/>
+                <w:sz w:val="32"/>
+                <w:szCs w:val="32"/>
+              </w:rPr>
+            </w:pPr>
+          </w:p>
+        </w:tc>
+        <w:tc>
+          <w:tcPr>
+            <w:tcW w:w="1463" w:type="dxa"/>
           </w:tcPr>
           <w:p>
             <w:pPr>
@@ -6724,7 +6724,7 @@
 </file>
 
 <file path=customXml/itemProps1.xml><?xml version="1.0" encoding="utf-8"?>
-<ds:datastoreItem xmlns:ds="http://schemas.openxmlformats.org/officeDocument/2006/customXml" ds:itemID="{303B2A5A-3B9B-4BF3-ACE4-018710CA10F1}">
+<ds:datastoreItem xmlns:ds="http://schemas.openxmlformats.org/officeDocument/2006/customXml" ds:itemID="{D1DEF21D-5A1F-416D-8D30-6641159CC45B}">
   <ds:schemaRefs>
     <ds:schemaRef ds:uri="http://schemas.openxmlformats.org/officeDocument/2006/bibliography"/>
   </ds:schemaRefs>

</xml_diff>

<commit_message>
Rollback to 5f36154 (use bijoy.converteraz.com API as primary, browser as fallback)
Restores the codebase to the exact state of 5f36154 while preserving the
intervening commits (2ae70e2, 66c9145) in history rather than discarding them.

Co-Authored-By: Claude Opus 4.8 (1M context) <noreply@anthropic.com>
</commit_message>
<xml_diff>
--- a/template_variants/DOCX/3HE_3PET1_0EST.docx
+++ b/template_variants/DOCX/3HE_3PET1_0EST.docx
@@ -23,8 +23,6 @@
         </w:rPr>
         <w:t>‡gvUi mvB‡Kj jMkxU</w:t>
       </w:r>
-      <w:bookmarkStart w:id="0" w:name="_GoBack"/>
-      <w:bookmarkEnd w:id="0"/>
     </w:p>
     <w:tbl>
       <w:tblPr>
@@ -112,6 +110,8 @@
               </w:rPr>
               <w:t>ª</w:t>
             </w:r>
+            <w:bookmarkStart w:id="0" w:name="_GoBack"/>
+            <w:bookmarkEnd w:id="0"/>
             <w:r>
               <w:rPr>
                 <w:rFonts w:ascii="SutonnyMJ" w:hAnsi="SutonnyMJ" w:cs="SutonnyMJ"/>
@@ -1884,11 +1884,11 @@
         <w:gridCol w:w="1080"/>
         <w:gridCol w:w="1080"/>
         <w:gridCol w:w="990"/>
-        <w:gridCol w:w="877"/>
+        <w:gridCol w:w="900"/>
         <w:gridCol w:w="1260"/>
-        <w:gridCol w:w="1170"/>
-        <w:gridCol w:w="1170"/>
-        <w:gridCol w:w="1463"/>
+        <w:gridCol w:w="1260"/>
+        <w:gridCol w:w="1260"/>
+        <w:gridCol w:w="1260"/>
         <w:gridCol w:w="990"/>
       </w:tblGrid>
       <w:tr>
@@ -2047,7 +2047,7 @@
         </w:tc>
         <w:tc>
           <w:tcPr>
-            <w:tcW w:w="2137" w:type="dxa"/>
+            <w:tcW w:w="2160" w:type="dxa"/>
             <w:gridSpan w:val="2"/>
             <w:tcBorders>
               <w:bottom w:val="single" w:sz="4" w:space="0" w:color="auto"/>
@@ -2077,7 +2077,7 @@
         </w:tc>
         <w:tc>
           <w:tcPr>
-            <w:tcW w:w="1170" w:type="dxa"/>
+            <w:tcW w:w="1260" w:type="dxa"/>
             <w:vMerge w:val="restart"/>
             <w:vAlign w:val="center"/>
           </w:tcPr>
@@ -2124,7 +2124,7 @@
         </w:tc>
         <w:tc>
           <w:tcPr>
-            <w:tcW w:w="1170" w:type="dxa"/>
+            <w:tcW w:w="1260" w:type="dxa"/>
             <w:vMerge w:val="restart"/>
             <w:vAlign w:val="center"/>
           </w:tcPr>
@@ -2171,7 +2171,7 @@
         </w:tc>
         <w:tc>
           <w:tcPr>
-            <w:tcW w:w="1463" w:type="dxa"/>
+            <w:tcW w:w="1260" w:type="dxa"/>
             <w:vMerge w:val="restart"/>
             <w:vAlign w:val="center"/>
           </w:tcPr>
@@ -2380,7 +2380,7 @@
         </w:tc>
         <w:tc>
           <w:tcPr>
-            <w:tcW w:w="877" w:type="dxa"/>
+            <w:tcW w:w="900" w:type="dxa"/>
             <w:tcBorders>
               <w:top w:val="single" w:sz="4" w:space="0" w:color="auto"/>
             </w:tcBorders>
@@ -2438,7 +2438,7 @@
         </w:tc>
         <w:tc>
           <w:tcPr>
-            <w:tcW w:w="1170" w:type="dxa"/>
+            <w:tcW w:w="1260" w:type="dxa"/>
             <w:vMerge/>
             <w:vAlign w:val="center"/>
           </w:tcPr>
@@ -2456,7 +2456,7 @@
         </w:tc>
         <w:tc>
           <w:tcPr>
-            <w:tcW w:w="1170" w:type="dxa"/>
+            <w:tcW w:w="1260" w:type="dxa"/>
             <w:vMerge/>
             <w:vAlign w:val="center"/>
           </w:tcPr>
@@ -2474,7 +2474,7 @@
         </w:tc>
         <w:tc>
           <w:tcPr>
-            <w:tcW w:w="1463" w:type="dxa"/>
+            <w:tcW w:w="1260" w:type="dxa"/>
             <w:vMerge/>
             <w:vAlign w:val="center"/>
           </w:tcPr>
@@ -2642,7 +2642,7 @@
         </w:tc>
         <w:tc>
           <w:tcPr>
-            <w:tcW w:w="877" w:type="dxa"/>
+            <w:tcW w:w="900" w:type="dxa"/>
             <w:vAlign w:val="center"/>
           </w:tcPr>
           <w:p>
@@ -2676,41 +2676,41 @@
         </w:tc>
         <w:tc>
           <w:tcPr>
-            <w:tcW w:w="1170" w:type="dxa"/>
-            <w:vAlign w:val="center"/>
-          </w:tcPr>
-          <w:p>
-            <w:pPr>
-              <w:jc w:val="center"/>
-              <w:rPr>
-                <w:rFonts w:ascii="SutonnyMJ" w:hAnsi="SutonnyMJ" w:cs="SutonnyMJ"/>
-                <w:b/>
-                <w:sz w:val="32"/>
-                <w:szCs w:val="32"/>
-              </w:rPr>
-            </w:pPr>
-          </w:p>
-        </w:tc>
-        <w:tc>
-          <w:tcPr>
-            <w:tcW w:w="1170" w:type="dxa"/>
-            <w:vAlign w:val="center"/>
-          </w:tcPr>
-          <w:p>
-            <w:pPr>
-              <w:jc w:val="center"/>
-              <w:rPr>
-                <w:rFonts w:ascii="SutonnyMJ" w:hAnsi="SutonnyMJ" w:cs="SutonnyMJ"/>
-                <w:b/>
-                <w:sz w:val="32"/>
-                <w:szCs w:val="32"/>
-              </w:rPr>
-            </w:pPr>
-          </w:p>
-        </w:tc>
-        <w:tc>
-          <w:tcPr>
-            <w:tcW w:w="1463" w:type="dxa"/>
+            <w:tcW w:w="1260" w:type="dxa"/>
+            <w:vAlign w:val="center"/>
+          </w:tcPr>
+          <w:p>
+            <w:pPr>
+              <w:jc w:val="center"/>
+              <w:rPr>
+                <w:rFonts w:ascii="SutonnyMJ" w:hAnsi="SutonnyMJ" w:cs="SutonnyMJ"/>
+                <w:b/>
+                <w:sz w:val="32"/>
+                <w:szCs w:val="32"/>
+              </w:rPr>
+            </w:pPr>
+          </w:p>
+        </w:tc>
+        <w:tc>
+          <w:tcPr>
+            <w:tcW w:w="1260" w:type="dxa"/>
+            <w:vAlign w:val="center"/>
+          </w:tcPr>
+          <w:p>
+            <w:pPr>
+              <w:jc w:val="center"/>
+              <w:rPr>
+                <w:rFonts w:ascii="SutonnyMJ" w:hAnsi="SutonnyMJ" w:cs="SutonnyMJ"/>
+                <w:b/>
+                <w:sz w:val="32"/>
+                <w:szCs w:val="32"/>
+              </w:rPr>
+            </w:pPr>
+          </w:p>
+        </w:tc>
+        <w:tc>
+          <w:tcPr>
+            <w:tcW w:w="1260" w:type="dxa"/>
             <w:vAlign w:val="center"/>
           </w:tcPr>
           <w:p>
@@ -2866,7 +2866,7 @@
         </w:tc>
         <w:tc>
           <w:tcPr>
-            <w:tcW w:w="877" w:type="dxa"/>
+            <w:tcW w:w="900" w:type="dxa"/>
           </w:tcPr>
           <w:p>
             <w:pPr>
@@ -2898,39 +2898,39 @@
         </w:tc>
         <w:tc>
           <w:tcPr>
-            <w:tcW w:w="1170" w:type="dxa"/>
-          </w:tcPr>
-          <w:p>
-            <w:pPr>
-              <w:jc w:val="center"/>
-              <w:rPr>
-                <w:rFonts w:ascii="SutonnyMJ" w:hAnsi="SutonnyMJ" w:cs="SutonnyMJ"/>
-                <w:b/>
-                <w:sz w:val="32"/>
-                <w:szCs w:val="32"/>
-              </w:rPr>
-            </w:pPr>
-          </w:p>
-        </w:tc>
-        <w:tc>
-          <w:tcPr>
-            <w:tcW w:w="1170" w:type="dxa"/>
-          </w:tcPr>
-          <w:p>
-            <w:pPr>
-              <w:jc w:val="center"/>
-              <w:rPr>
-                <w:rFonts w:ascii="SutonnyMJ" w:hAnsi="SutonnyMJ" w:cs="SutonnyMJ"/>
-                <w:b/>
-                <w:sz w:val="32"/>
-                <w:szCs w:val="32"/>
-              </w:rPr>
-            </w:pPr>
-          </w:p>
-        </w:tc>
-        <w:tc>
-          <w:tcPr>
-            <w:tcW w:w="1463" w:type="dxa"/>
+            <w:tcW w:w="1260" w:type="dxa"/>
+          </w:tcPr>
+          <w:p>
+            <w:pPr>
+              <w:jc w:val="center"/>
+              <w:rPr>
+                <w:rFonts w:ascii="SutonnyMJ" w:hAnsi="SutonnyMJ" w:cs="SutonnyMJ"/>
+                <w:b/>
+                <w:sz w:val="32"/>
+                <w:szCs w:val="32"/>
+              </w:rPr>
+            </w:pPr>
+          </w:p>
+        </w:tc>
+        <w:tc>
+          <w:tcPr>
+            <w:tcW w:w="1260" w:type="dxa"/>
+          </w:tcPr>
+          <w:p>
+            <w:pPr>
+              <w:jc w:val="center"/>
+              <w:rPr>
+                <w:rFonts w:ascii="SutonnyMJ" w:hAnsi="SutonnyMJ" w:cs="SutonnyMJ"/>
+                <w:b/>
+                <w:sz w:val="32"/>
+                <w:szCs w:val="32"/>
+              </w:rPr>
+            </w:pPr>
+          </w:p>
+        </w:tc>
+        <w:tc>
+          <w:tcPr>
+            <w:tcW w:w="1260" w:type="dxa"/>
           </w:tcPr>
           <w:p>
             <w:pPr>
@@ -3074,7 +3074,7 @@
         </w:tc>
         <w:tc>
           <w:tcPr>
-            <w:tcW w:w="877" w:type="dxa"/>
+            <w:tcW w:w="900" w:type="dxa"/>
           </w:tcPr>
           <w:p>
             <w:pPr>
@@ -3106,39 +3106,39 @@
         </w:tc>
         <w:tc>
           <w:tcPr>
-            <w:tcW w:w="1170" w:type="dxa"/>
-          </w:tcPr>
-          <w:p>
-            <w:pPr>
-              <w:jc w:val="center"/>
-              <w:rPr>
-                <w:rFonts w:ascii="SutonnyMJ" w:hAnsi="SutonnyMJ" w:cs="SutonnyMJ"/>
-                <w:b/>
-                <w:sz w:val="32"/>
-                <w:szCs w:val="32"/>
-              </w:rPr>
-            </w:pPr>
-          </w:p>
-        </w:tc>
-        <w:tc>
-          <w:tcPr>
-            <w:tcW w:w="1170" w:type="dxa"/>
-          </w:tcPr>
-          <w:p>
-            <w:pPr>
-              <w:jc w:val="center"/>
-              <w:rPr>
-                <w:rFonts w:ascii="SutonnyMJ" w:hAnsi="SutonnyMJ" w:cs="SutonnyMJ"/>
-                <w:b/>
-                <w:sz w:val="32"/>
-                <w:szCs w:val="32"/>
-              </w:rPr>
-            </w:pPr>
-          </w:p>
-        </w:tc>
-        <w:tc>
-          <w:tcPr>
-            <w:tcW w:w="1463" w:type="dxa"/>
+            <w:tcW w:w="1260" w:type="dxa"/>
+          </w:tcPr>
+          <w:p>
+            <w:pPr>
+              <w:jc w:val="center"/>
+              <w:rPr>
+                <w:rFonts w:ascii="SutonnyMJ" w:hAnsi="SutonnyMJ" w:cs="SutonnyMJ"/>
+                <w:b/>
+                <w:sz w:val="32"/>
+                <w:szCs w:val="32"/>
+              </w:rPr>
+            </w:pPr>
+          </w:p>
+        </w:tc>
+        <w:tc>
+          <w:tcPr>
+            <w:tcW w:w="1260" w:type="dxa"/>
+          </w:tcPr>
+          <w:p>
+            <w:pPr>
+              <w:jc w:val="center"/>
+              <w:rPr>
+                <w:rFonts w:ascii="SutonnyMJ" w:hAnsi="SutonnyMJ" w:cs="SutonnyMJ"/>
+                <w:b/>
+                <w:sz w:val="32"/>
+                <w:szCs w:val="32"/>
+              </w:rPr>
+            </w:pPr>
+          </w:p>
+        </w:tc>
+        <w:tc>
+          <w:tcPr>
+            <w:tcW w:w="1260" w:type="dxa"/>
           </w:tcPr>
           <w:p>
             <w:pPr>
@@ -3279,7 +3279,7 @@
         </w:tc>
         <w:tc>
           <w:tcPr>
-            <w:tcW w:w="877" w:type="dxa"/>
+            <w:tcW w:w="900" w:type="dxa"/>
           </w:tcPr>
           <w:p>
             <w:pPr>
@@ -3311,39 +3311,39 @@
         </w:tc>
         <w:tc>
           <w:tcPr>
-            <w:tcW w:w="1170" w:type="dxa"/>
-          </w:tcPr>
-          <w:p>
-            <w:pPr>
-              <w:jc w:val="center"/>
-              <w:rPr>
-                <w:rFonts w:ascii="SutonnyMJ" w:hAnsi="SutonnyMJ" w:cs="SutonnyMJ"/>
-                <w:b/>
-                <w:sz w:val="32"/>
-                <w:szCs w:val="32"/>
-              </w:rPr>
-            </w:pPr>
-          </w:p>
-        </w:tc>
-        <w:tc>
-          <w:tcPr>
-            <w:tcW w:w="1170" w:type="dxa"/>
-          </w:tcPr>
-          <w:p>
-            <w:pPr>
-              <w:jc w:val="center"/>
-              <w:rPr>
-                <w:rFonts w:ascii="SutonnyMJ" w:hAnsi="SutonnyMJ" w:cs="SutonnyMJ"/>
-                <w:b/>
-                <w:sz w:val="32"/>
-                <w:szCs w:val="32"/>
-              </w:rPr>
-            </w:pPr>
-          </w:p>
-        </w:tc>
-        <w:tc>
-          <w:tcPr>
-            <w:tcW w:w="1463" w:type="dxa"/>
+            <w:tcW w:w="1260" w:type="dxa"/>
+          </w:tcPr>
+          <w:p>
+            <w:pPr>
+              <w:jc w:val="center"/>
+              <w:rPr>
+                <w:rFonts w:ascii="SutonnyMJ" w:hAnsi="SutonnyMJ" w:cs="SutonnyMJ"/>
+                <w:b/>
+                <w:sz w:val="32"/>
+                <w:szCs w:val="32"/>
+              </w:rPr>
+            </w:pPr>
+          </w:p>
+        </w:tc>
+        <w:tc>
+          <w:tcPr>
+            <w:tcW w:w="1260" w:type="dxa"/>
+          </w:tcPr>
+          <w:p>
+            <w:pPr>
+              <w:jc w:val="center"/>
+              <w:rPr>
+                <w:rFonts w:ascii="SutonnyMJ" w:hAnsi="SutonnyMJ" w:cs="SutonnyMJ"/>
+                <w:b/>
+                <w:sz w:val="32"/>
+                <w:szCs w:val="32"/>
+              </w:rPr>
+            </w:pPr>
+          </w:p>
+        </w:tc>
+        <w:tc>
+          <w:tcPr>
+            <w:tcW w:w="1260" w:type="dxa"/>
           </w:tcPr>
           <w:p>
             <w:pPr>
@@ -6724,7 +6724,7 @@
 </file>
 
 <file path=customXml/itemProps1.xml><?xml version="1.0" encoding="utf-8"?>
-<ds:datastoreItem xmlns:ds="http://schemas.openxmlformats.org/officeDocument/2006/customXml" ds:itemID="{D1DEF21D-5A1F-416D-8D30-6641159CC45B}">
+<ds:datastoreItem xmlns:ds="http://schemas.openxmlformats.org/officeDocument/2006/customXml" ds:itemID="{303B2A5A-3B9B-4BF3-ACE4-018710CA10F1}">
   <ds:schemaRefs>
     <ds:schemaRef ds:uri="http://schemas.openxmlformats.org/officeDocument/2006/bibliography"/>
   </ds:schemaRefs>

</xml_diff>

<commit_message>
chore(templates): update logsheet templates and regenerate all 56 variants
Co-Authored-By: Claude Opus 4.8 (1M context) <noreply@anthropic.com>
</commit_message>
<xml_diff>
--- a/template_variants/DOCX/3HE_3PET1_0EST.docx
+++ b/template_variants/DOCX/3HE_3PET1_0EST.docx
@@ -23,6 +23,8 @@
         </w:rPr>
         <w:t>‡gvUi mvB‡Kj jMkxU</w:t>
       </w:r>
+      <w:bookmarkStart w:id="0" w:name="_GoBack"/>
+      <w:bookmarkEnd w:id="0"/>
     </w:p>
     <w:tbl>
       <w:tblPr>
@@ -110,8 +112,6 @@
               </w:rPr>
               <w:t>ª</w:t>
             </w:r>
-            <w:bookmarkStart w:id="0" w:name="_GoBack"/>
-            <w:bookmarkEnd w:id="0"/>
             <w:r>
               <w:rPr>
                 <w:rFonts w:ascii="SutonnyMJ" w:hAnsi="SutonnyMJ" w:cs="SutonnyMJ"/>
@@ -1884,11 +1884,11 @@
         <w:gridCol w:w="1080"/>
         <w:gridCol w:w="1080"/>
         <w:gridCol w:w="990"/>
-        <w:gridCol w:w="900"/>
+        <w:gridCol w:w="877"/>
         <w:gridCol w:w="1260"/>
-        <w:gridCol w:w="1260"/>
-        <w:gridCol w:w="1260"/>
-        <w:gridCol w:w="1260"/>
+        <w:gridCol w:w="1170"/>
+        <w:gridCol w:w="1170"/>
+        <w:gridCol w:w="1463"/>
         <w:gridCol w:w="990"/>
       </w:tblGrid>
       <w:tr>
@@ -2047,7 +2047,7 @@
         </w:tc>
         <w:tc>
           <w:tcPr>
-            <w:tcW w:w="2160" w:type="dxa"/>
+            <w:tcW w:w="2137" w:type="dxa"/>
             <w:gridSpan w:val="2"/>
             <w:tcBorders>
               <w:bottom w:val="single" w:sz="4" w:space="0" w:color="auto"/>
@@ -2077,7 +2077,7 @@
         </w:tc>
         <w:tc>
           <w:tcPr>
-            <w:tcW w:w="1260" w:type="dxa"/>
+            <w:tcW w:w="1170" w:type="dxa"/>
             <w:vMerge w:val="restart"/>
             <w:vAlign w:val="center"/>
           </w:tcPr>
@@ -2124,7 +2124,7 @@
         </w:tc>
         <w:tc>
           <w:tcPr>
-            <w:tcW w:w="1260" w:type="dxa"/>
+            <w:tcW w:w="1170" w:type="dxa"/>
             <w:vMerge w:val="restart"/>
             <w:vAlign w:val="center"/>
           </w:tcPr>
@@ -2171,7 +2171,7 @@
         </w:tc>
         <w:tc>
           <w:tcPr>
-            <w:tcW w:w="1260" w:type="dxa"/>
+            <w:tcW w:w="1463" w:type="dxa"/>
             <w:vMerge w:val="restart"/>
             <w:vAlign w:val="center"/>
           </w:tcPr>
@@ -2380,7 +2380,7 @@
         </w:tc>
         <w:tc>
           <w:tcPr>
-            <w:tcW w:w="900" w:type="dxa"/>
+            <w:tcW w:w="877" w:type="dxa"/>
             <w:tcBorders>
               <w:top w:val="single" w:sz="4" w:space="0" w:color="auto"/>
             </w:tcBorders>
@@ -2438,7 +2438,7 @@
         </w:tc>
         <w:tc>
           <w:tcPr>
-            <w:tcW w:w="1260" w:type="dxa"/>
+            <w:tcW w:w="1170" w:type="dxa"/>
             <w:vMerge/>
             <w:vAlign w:val="center"/>
           </w:tcPr>
@@ -2456,7 +2456,7 @@
         </w:tc>
         <w:tc>
           <w:tcPr>
-            <w:tcW w:w="1260" w:type="dxa"/>
+            <w:tcW w:w="1170" w:type="dxa"/>
             <w:vMerge/>
             <w:vAlign w:val="center"/>
           </w:tcPr>
@@ -2474,7 +2474,7 @@
         </w:tc>
         <w:tc>
           <w:tcPr>
-            <w:tcW w:w="1260" w:type="dxa"/>
+            <w:tcW w:w="1463" w:type="dxa"/>
             <w:vMerge/>
             <w:vAlign w:val="center"/>
           </w:tcPr>
@@ -2642,7 +2642,7 @@
         </w:tc>
         <w:tc>
           <w:tcPr>
-            <w:tcW w:w="900" w:type="dxa"/>
+            <w:tcW w:w="877" w:type="dxa"/>
             <w:vAlign w:val="center"/>
           </w:tcPr>
           <w:p>
@@ -2676,41 +2676,41 @@
         </w:tc>
         <w:tc>
           <w:tcPr>
-            <w:tcW w:w="1260" w:type="dxa"/>
-            <w:vAlign w:val="center"/>
-          </w:tcPr>
-          <w:p>
-            <w:pPr>
-              <w:jc w:val="center"/>
-              <w:rPr>
-                <w:rFonts w:ascii="SutonnyMJ" w:hAnsi="SutonnyMJ" w:cs="SutonnyMJ"/>
-                <w:b/>
-                <w:sz w:val="32"/>
-                <w:szCs w:val="32"/>
-              </w:rPr>
-            </w:pPr>
-          </w:p>
-        </w:tc>
-        <w:tc>
-          <w:tcPr>
-            <w:tcW w:w="1260" w:type="dxa"/>
-            <w:vAlign w:val="center"/>
-          </w:tcPr>
-          <w:p>
-            <w:pPr>
-              <w:jc w:val="center"/>
-              <w:rPr>
-                <w:rFonts w:ascii="SutonnyMJ" w:hAnsi="SutonnyMJ" w:cs="SutonnyMJ"/>
-                <w:b/>
-                <w:sz w:val="32"/>
-                <w:szCs w:val="32"/>
-              </w:rPr>
-            </w:pPr>
-          </w:p>
-        </w:tc>
-        <w:tc>
-          <w:tcPr>
-            <w:tcW w:w="1260" w:type="dxa"/>
+            <w:tcW w:w="1170" w:type="dxa"/>
+            <w:vAlign w:val="center"/>
+          </w:tcPr>
+          <w:p>
+            <w:pPr>
+              <w:jc w:val="center"/>
+              <w:rPr>
+                <w:rFonts w:ascii="SutonnyMJ" w:hAnsi="SutonnyMJ" w:cs="SutonnyMJ"/>
+                <w:b/>
+                <w:sz w:val="32"/>
+                <w:szCs w:val="32"/>
+              </w:rPr>
+            </w:pPr>
+          </w:p>
+        </w:tc>
+        <w:tc>
+          <w:tcPr>
+            <w:tcW w:w="1170" w:type="dxa"/>
+            <w:vAlign w:val="center"/>
+          </w:tcPr>
+          <w:p>
+            <w:pPr>
+              <w:jc w:val="center"/>
+              <w:rPr>
+                <w:rFonts w:ascii="SutonnyMJ" w:hAnsi="SutonnyMJ" w:cs="SutonnyMJ"/>
+                <w:b/>
+                <w:sz w:val="32"/>
+                <w:szCs w:val="32"/>
+              </w:rPr>
+            </w:pPr>
+          </w:p>
+        </w:tc>
+        <w:tc>
+          <w:tcPr>
+            <w:tcW w:w="1463" w:type="dxa"/>
             <w:vAlign w:val="center"/>
           </w:tcPr>
           <w:p>
@@ -2866,7 +2866,7 @@
         </w:tc>
         <w:tc>
           <w:tcPr>
-            <w:tcW w:w="900" w:type="dxa"/>
+            <w:tcW w:w="877" w:type="dxa"/>
           </w:tcPr>
           <w:p>
             <w:pPr>
@@ -2898,39 +2898,39 @@
         </w:tc>
         <w:tc>
           <w:tcPr>
-            <w:tcW w:w="1260" w:type="dxa"/>
-          </w:tcPr>
-          <w:p>
-            <w:pPr>
-              <w:jc w:val="center"/>
-              <w:rPr>
-                <w:rFonts w:ascii="SutonnyMJ" w:hAnsi="SutonnyMJ" w:cs="SutonnyMJ"/>
-                <w:b/>
-                <w:sz w:val="32"/>
-                <w:szCs w:val="32"/>
-              </w:rPr>
-            </w:pPr>
-          </w:p>
-        </w:tc>
-        <w:tc>
-          <w:tcPr>
-            <w:tcW w:w="1260" w:type="dxa"/>
-          </w:tcPr>
-          <w:p>
-            <w:pPr>
-              <w:jc w:val="center"/>
-              <w:rPr>
-                <w:rFonts w:ascii="SutonnyMJ" w:hAnsi="SutonnyMJ" w:cs="SutonnyMJ"/>
-                <w:b/>
-                <w:sz w:val="32"/>
-                <w:szCs w:val="32"/>
-              </w:rPr>
-            </w:pPr>
-          </w:p>
-        </w:tc>
-        <w:tc>
-          <w:tcPr>
-            <w:tcW w:w="1260" w:type="dxa"/>
+            <w:tcW w:w="1170" w:type="dxa"/>
+          </w:tcPr>
+          <w:p>
+            <w:pPr>
+              <w:jc w:val="center"/>
+              <w:rPr>
+                <w:rFonts w:ascii="SutonnyMJ" w:hAnsi="SutonnyMJ" w:cs="SutonnyMJ"/>
+                <w:b/>
+                <w:sz w:val="32"/>
+                <w:szCs w:val="32"/>
+              </w:rPr>
+            </w:pPr>
+          </w:p>
+        </w:tc>
+        <w:tc>
+          <w:tcPr>
+            <w:tcW w:w="1170" w:type="dxa"/>
+          </w:tcPr>
+          <w:p>
+            <w:pPr>
+              <w:jc w:val="center"/>
+              <w:rPr>
+                <w:rFonts w:ascii="SutonnyMJ" w:hAnsi="SutonnyMJ" w:cs="SutonnyMJ"/>
+                <w:b/>
+                <w:sz w:val="32"/>
+                <w:szCs w:val="32"/>
+              </w:rPr>
+            </w:pPr>
+          </w:p>
+        </w:tc>
+        <w:tc>
+          <w:tcPr>
+            <w:tcW w:w="1463" w:type="dxa"/>
           </w:tcPr>
           <w:p>
             <w:pPr>
@@ -3074,7 +3074,7 @@
         </w:tc>
         <w:tc>
           <w:tcPr>
-            <w:tcW w:w="900" w:type="dxa"/>
+            <w:tcW w:w="877" w:type="dxa"/>
           </w:tcPr>
           <w:p>
             <w:pPr>
@@ -3106,39 +3106,39 @@
         </w:tc>
         <w:tc>
           <w:tcPr>
-            <w:tcW w:w="1260" w:type="dxa"/>
-          </w:tcPr>
-          <w:p>
-            <w:pPr>
-              <w:jc w:val="center"/>
-              <w:rPr>
-                <w:rFonts w:ascii="SutonnyMJ" w:hAnsi="SutonnyMJ" w:cs="SutonnyMJ"/>
-                <w:b/>
-                <w:sz w:val="32"/>
-                <w:szCs w:val="32"/>
-              </w:rPr>
-            </w:pPr>
-          </w:p>
-        </w:tc>
-        <w:tc>
-          <w:tcPr>
-            <w:tcW w:w="1260" w:type="dxa"/>
-          </w:tcPr>
-          <w:p>
-            <w:pPr>
-              <w:jc w:val="center"/>
-              <w:rPr>
-                <w:rFonts w:ascii="SutonnyMJ" w:hAnsi="SutonnyMJ" w:cs="SutonnyMJ"/>
-                <w:b/>
-                <w:sz w:val="32"/>
-                <w:szCs w:val="32"/>
-              </w:rPr>
-            </w:pPr>
-          </w:p>
-        </w:tc>
-        <w:tc>
-          <w:tcPr>
-            <w:tcW w:w="1260" w:type="dxa"/>
+            <w:tcW w:w="1170" w:type="dxa"/>
+          </w:tcPr>
+          <w:p>
+            <w:pPr>
+              <w:jc w:val="center"/>
+              <w:rPr>
+                <w:rFonts w:ascii="SutonnyMJ" w:hAnsi="SutonnyMJ" w:cs="SutonnyMJ"/>
+                <w:b/>
+                <w:sz w:val="32"/>
+                <w:szCs w:val="32"/>
+              </w:rPr>
+            </w:pPr>
+          </w:p>
+        </w:tc>
+        <w:tc>
+          <w:tcPr>
+            <w:tcW w:w="1170" w:type="dxa"/>
+          </w:tcPr>
+          <w:p>
+            <w:pPr>
+              <w:jc w:val="center"/>
+              <w:rPr>
+                <w:rFonts w:ascii="SutonnyMJ" w:hAnsi="SutonnyMJ" w:cs="SutonnyMJ"/>
+                <w:b/>
+                <w:sz w:val="32"/>
+                <w:szCs w:val="32"/>
+              </w:rPr>
+            </w:pPr>
+          </w:p>
+        </w:tc>
+        <w:tc>
+          <w:tcPr>
+            <w:tcW w:w="1463" w:type="dxa"/>
           </w:tcPr>
           <w:p>
             <w:pPr>
@@ -3279,7 +3279,7 @@
         </w:tc>
         <w:tc>
           <w:tcPr>
-            <w:tcW w:w="900" w:type="dxa"/>
+            <w:tcW w:w="877" w:type="dxa"/>
           </w:tcPr>
           <w:p>
             <w:pPr>
@@ -3311,39 +3311,39 @@
         </w:tc>
         <w:tc>
           <w:tcPr>
-            <w:tcW w:w="1260" w:type="dxa"/>
-          </w:tcPr>
-          <w:p>
-            <w:pPr>
-              <w:jc w:val="center"/>
-              <w:rPr>
-                <w:rFonts w:ascii="SutonnyMJ" w:hAnsi="SutonnyMJ" w:cs="SutonnyMJ"/>
-                <w:b/>
-                <w:sz w:val="32"/>
-                <w:szCs w:val="32"/>
-              </w:rPr>
-            </w:pPr>
-          </w:p>
-        </w:tc>
-        <w:tc>
-          <w:tcPr>
-            <w:tcW w:w="1260" w:type="dxa"/>
-          </w:tcPr>
-          <w:p>
-            <w:pPr>
-              <w:jc w:val="center"/>
-              <w:rPr>
-                <w:rFonts w:ascii="SutonnyMJ" w:hAnsi="SutonnyMJ" w:cs="SutonnyMJ"/>
-                <w:b/>
-                <w:sz w:val="32"/>
-                <w:szCs w:val="32"/>
-              </w:rPr>
-            </w:pPr>
-          </w:p>
-        </w:tc>
-        <w:tc>
-          <w:tcPr>
-            <w:tcW w:w="1260" w:type="dxa"/>
+            <w:tcW w:w="1170" w:type="dxa"/>
+          </w:tcPr>
+          <w:p>
+            <w:pPr>
+              <w:jc w:val="center"/>
+              <w:rPr>
+                <w:rFonts w:ascii="SutonnyMJ" w:hAnsi="SutonnyMJ" w:cs="SutonnyMJ"/>
+                <w:b/>
+                <w:sz w:val="32"/>
+                <w:szCs w:val="32"/>
+              </w:rPr>
+            </w:pPr>
+          </w:p>
+        </w:tc>
+        <w:tc>
+          <w:tcPr>
+            <w:tcW w:w="1170" w:type="dxa"/>
+          </w:tcPr>
+          <w:p>
+            <w:pPr>
+              <w:jc w:val="center"/>
+              <w:rPr>
+                <w:rFonts w:ascii="SutonnyMJ" w:hAnsi="SutonnyMJ" w:cs="SutonnyMJ"/>
+                <w:b/>
+                <w:sz w:val="32"/>
+                <w:szCs w:val="32"/>
+              </w:rPr>
+            </w:pPr>
+          </w:p>
+        </w:tc>
+        <w:tc>
+          <w:tcPr>
+            <w:tcW w:w="1463" w:type="dxa"/>
           </w:tcPr>
           <w:p>
             <w:pPr>
@@ -6724,7 +6724,7 @@
 </file>
 
 <file path=customXml/itemProps1.xml><?xml version="1.0" encoding="utf-8"?>
-<ds:datastoreItem xmlns:ds="http://schemas.openxmlformats.org/officeDocument/2006/customXml" ds:itemID="{303B2A5A-3B9B-4BF3-ACE4-018710CA10F1}">
+<ds:datastoreItem xmlns:ds="http://schemas.openxmlformats.org/officeDocument/2006/customXml" ds:itemID="{D1DEF21D-5A1F-416D-8D30-6641159CC45B}">
   <ds:schemaRefs>
     <ds:schemaRef ds:uri="http://schemas.openxmlformats.org/officeDocument/2006/bibliography"/>
   </ds:schemaRefs>

</xml_diff>

<commit_message>
Fix archive: exclude current month, add missing state transition; fix price propagation bug; regenerate templates
</commit_message>
<xml_diff>
--- a/template_variants/DOCX/3HE_3PET1_0EST.docx
+++ b/template_variants/DOCX/3HE_3PET1_0EST.docx
@@ -23,8 +23,6 @@
         </w:rPr>
         <w:t>‡gvUi mvB‡Kj jMkxU</w:t>
       </w:r>
-      <w:bookmarkStart w:id="0" w:name="_GoBack"/>
-      <w:bookmarkEnd w:id="0"/>
     </w:p>
     <w:tbl>
       <w:tblPr>
@@ -1887,8 +1885,8 @@
         <w:gridCol w:w="877"/>
         <w:gridCol w:w="1260"/>
         <w:gridCol w:w="1170"/>
-        <w:gridCol w:w="1170"/>
-        <w:gridCol w:w="1463"/>
+        <w:gridCol w:w="1260"/>
+        <w:gridCol w:w="1373"/>
         <w:gridCol w:w="990"/>
       </w:tblGrid>
       <w:tr>
@@ -2124,7 +2122,7 @@
         </w:tc>
         <w:tc>
           <w:tcPr>
-            <w:tcW w:w="1170" w:type="dxa"/>
+            <w:tcW w:w="1260" w:type="dxa"/>
             <w:vMerge w:val="restart"/>
             <w:vAlign w:val="center"/>
           </w:tcPr>
@@ -2171,7 +2169,7 @@
         </w:tc>
         <w:tc>
           <w:tcPr>
-            <w:tcW w:w="1463" w:type="dxa"/>
+            <w:tcW w:w="1373" w:type="dxa"/>
             <w:vMerge w:val="restart"/>
             <w:vAlign w:val="center"/>
           </w:tcPr>
@@ -2456,7 +2454,7 @@
         </w:tc>
         <w:tc>
           <w:tcPr>
-            <w:tcW w:w="1170" w:type="dxa"/>
+            <w:tcW w:w="1260" w:type="dxa"/>
             <w:vMerge/>
             <w:vAlign w:val="center"/>
           </w:tcPr>
@@ -2474,7 +2472,7 @@
         </w:tc>
         <w:tc>
           <w:tcPr>
-            <w:tcW w:w="1463" w:type="dxa"/>
+            <w:tcW w:w="1373" w:type="dxa"/>
             <w:vMerge/>
             <w:vAlign w:val="center"/>
           </w:tcPr>
@@ -2638,6 +2636,8 @@
                 <w:szCs w:val="32"/>
               </w:rPr>
             </w:pPr>
+            <w:bookmarkStart w:id="0" w:name="_GoBack"/>
+            <w:bookmarkEnd w:id="0"/>
           </w:p>
         </w:tc>
         <w:tc>
@@ -2693,24 +2693,24 @@
         </w:tc>
         <w:tc>
           <w:tcPr>
-            <w:tcW w:w="1170" w:type="dxa"/>
-            <w:vAlign w:val="center"/>
-          </w:tcPr>
-          <w:p>
-            <w:pPr>
-              <w:jc w:val="center"/>
-              <w:rPr>
-                <w:rFonts w:ascii="SutonnyMJ" w:hAnsi="SutonnyMJ" w:cs="SutonnyMJ"/>
-                <w:b/>
-                <w:sz w:val="32"/>
-                <w:szCs w:val="32"/>
-              </w:rPr>
-            </w:pPr>
-          </w:p>
-        </w:tc>
-        <w:tc>
-          <w:tcPr>
-            <w:tcW w:w="1463" w:type="dxa"/>
+            <w:tcW w:w="1260" w:type="dxa"/>
+            <w:vAlign w:val="center"/>
+          </w:tcPr>
+          <w:p>
+            <w:pPr>
+              <w:jc w:val="center"/>
+              <w:rPr>
+                <w:rFonts w:ascii="SutonnyMJ" w:hAnsi="SutonnyMJ" w:cs="SutonnyMJ"/>
+                <w:b/>
+                <w:sz w:val="32"/>
+                <w:szCs w:val="32"/>
+              </w:rPr>
+            </w:pPr>
+          </w:p>
+        </w:tc>
+        <w:tc>
+          <w:tcPr>
+            <w:tcW w:w="1373" w:type="dxa"/>
             <w:vAlign w:val="center"/>
           </w:tcPr>
           <w:p>
@@ -2914,23 +2914,23 @@
         </w:tc>
         <w:tc>
           <w:tcPr>
-            <w:tcW w:w="1170" w:type="dxa"/>
-          </w:tcPr>
-          <w:p>
-            <w:pPr>
-              <w:jc w:val="center"/>
-              <w:rPr>
-                <w:rFonts w:ascii="SutonnyMJ" w:hAnsi="SutonnyMJ" w:cs="SutonnyMJ"/>
-                <w:b/>
-                <w:sz w:val="32"/>
-                <w:szCs w:val="32"/>
-              </w:rPr>
-            </w:pPr>
-          </w:p>
-        </w:tc>
-        <w:tc>
-          <w:tcPr>
-            <w:tcW w:w="1463" w:type="dxa"/>
+            <w:tcW w:w="1260" w:type="dxa"/>
+          </w:tcPr>
+          <w:p>
+            <w:pPr>
+              <w:jc w:val="center"/>
+              <w:rPr>
+                <w:rFonts w:ascii="SutonnyMJ" w:hAnsi="SutonnyMJ" w:cs="SutonnyMJ"/>
+                <w:b/>
+                <w:sz w:val="32"/>
+                <w:szCs w:val="32"/>
+              </w:rPr>
+            </w:pPr>
+          </w:p>
+        </w:tc>
+        <w:tc>
+          <w:tcPr>
+            <w:tcW w:w="1373" w:type="dxa"/>
           </w:tcPr>
           <w:p>
             <w:pPr>
@@ -3122,23 +3122,23 @@
         </w:tc>
         <w:tc>
           <w:tcPr>
-            <w:tcW w:w="1170" w:type="dxa"/>
-          </w:tcPr>
-          <w:p>
-            <w:pPr>
-              <w:jc w:val="center"/>
-              <w:rPr>
-                <w:rFonts w:ascii="SutonnyMJ" w:hAnsi="SutonnyMJ" w:cs="SutonnyMJ"/>
-                <w:b/>
-                <w:sz w:val="32"/>
-                <w:szCs w:val="32"/>
-              </w:rPr>
-            </w:pPr>
-          </w:p>
-        </w:tc>
-        <w:tc>
-          <w:tcPr>
-            <w:tcW w:w="1463" w:type="dxa"/>
+            <w:tcW w:w="1260" w:type="dxa"/>
+          </w:tcPr>
+          <w:p>
+            <w:pPr>
+              <w:jc w:val="center"/>
+              <w:rPr>
+                <w:rFonts w:ascii="SutonnyMJ" w:hAnsi="SutonnyMJ" w:cs="SutonnyMJ"/>
+                <w:b/>
+                <w:sz w:val="32"/>
+                <w:szCs w:val="32"/>
+              </w:rPr>
+            </w:pPr>
+          </w:p>
+        </w:tc>
+        <w:tc>
+          <w:tcPr>
+            <w:tcW w:w="1373" w:type="dxa"/>
           </w:tcPr>
           <w:p>
             <w:pPr>
@@ -3327,23 +3327,23 @@
         </w:tc>
         <w:tc>
           <w:tcPr>
-            <w:tcW w:w="1170" w:type="dxa"/>
-          </w:tcPr>
-          <w:p>
-            <w:pPr>
-              <w:jc w:val="center"/>
-              <w:rPr>
-                <w:rFonts w:ascii="SutonnyMJ" w:hAnsi="SutonnyMJ" w:cs="SutonnyMJ"/>
-                <w:b/>
-                <w:sz w:val="32"/>
-                <w:szCs w:val="32"/>
-              </w:rPr>
-            </w:pPr>
-          </w:p>
-        </w:tc>
-        <w:tc>
-          <w:tcPr>
-            <w:tcW w:w="1463" w:type="dxa"/>
+            <w:tcW w:w="1260" w:type="dxa"/>
+          </w:tcPr>
+          <w:p>
+            <w:pPr>
+              <w:jc w:val="center"/>
+              <w:rPr>
+                <w:rFonts w:ascii="SutonnyMJ" w:hAnsi="SutonnyMJ" w:cs="SutonnyMJ"/>
+                <w:b/>
+                <w:sz w:val="32"/>
+                <w:szCs w:val="32"/>
+              </w:rPr>
+            </w:pPr>
+          </w:p>
+        </w:tc>
+        <w:tc>
+          <w:tcPr>
+            <w:tcW w:w="1373" w:type="dxa"/>
           </w:tcPr>
           <w:p>
             <w:pPr>
@@ -6724,7 +6724,7 @@
 </file>
 
 <file path=customXml/itemProps1.xml><?xml version="1.0" encoding="utf-8"?>
-<ds:datastoreItem xmlns:ds="http://schemas.openxmlformats.org/officeDocument/2006/customXml" ds:itemID="{D1DEF21D-5A1F-416D-8D30-6641159CC45B}">
+<ds:datastoreItem xmlns:ds="http://schemas.openxmlformats.org/officeDocument/2006/customXml" ds:itemID="{C19CAC3A-54B5-432A-B99C-44545CC57890}">
   <ds:schemaRefs>
     <ds:schemaRef ds:uri="http://schemas.openxmlformats.org/officeDocument/2006/bibliography"/>
   </ds:schemaRefs>

</xml_diff>